<commit_message>
Word form: pin text direction to left-to-right
Word set up for Arabic applied its right-to-left default to paragraphs that
did not state a direction, so the English form opened mirrored. Set bidi=0
on every paragraph and in the defaults, bidiVisual=0 on every table, and
en-US as the default language.

Co-Authored-By: Claude Opus 5.5 <noreply@anthropic.com>
Claude-Session: https://claude.ai/code/session_01RraC7XJcmGmEBTtmV8pHiq
</commit_message>
<xml_diff>
--- a/client-contact-form/output/Elevatus - Client Contact Details Form.docx
+++ b/client-contact-form/output/Elevatus - Client Contact Details Form.docx
@@ -4,6 +4,7 @@
   <w:body>
     <w:p>
       <w:pPr>
+        <w:bidi w:val="0"/>
         <w:spacing w:after="0" w:before="0" w:line="20" w:lineRule="exact"/>
       </w:pPr>
       <w:r>
@@ -57,6 +58,7 @@
     </w:p>
     <w:p>
       <w:pPr>
+        <w:bidi w:val="0"/>
         <w:sectPr>
           <w:pgSz w:w="11906" w:h="16838" w:orient="portrait"/>
           <w:pgMar w:top="0" w:right="0" w:bottom="0" w:left="0" w:header="0" w:footer="0" w:gutter="0"/>
@@ -67,6 +69,7 @@
     </w:p>
     <w:p>
       <w:pPr>
+        <w:bidi w:val="0"/>
         <w:spacing w:after="120" w:before="0"/>
       </w:pPr>
       <w:r>
@@ -82,6 +85,7 @@
     </w:p>
     <w:p>
       <w:pPr>
+        <w:bidi w:val="0"/>
         <w:spacing w:after="120"/>
       </w:pPr>
       <w:r>
@@ -96,6 +100,7 @@
     </w:p>
     <w:p>
       <w:pPr>
+        <w:bidi w:val="0"/>
         <w:spacing w:after="220" w:line="284" w:lineRule="exact"/>
       </w:pPr>
       <w:r>
@@ -110,6 +115,7 @@
     </w:p>
     <w:tbl>
       <w:tblPr>
+        <w:bidiVisual w:val="0"/>
         <w:tblW w:type="dxa" w:w="9986"/>
         <w:tblBorders>
           <w:top w:val="none" w:color="FFFFFF" w:sz="0"/>
@@ -146,6 +152,7 @@
           </w:tcPr>
           <w:p>
             <w:pPr>
+              <w:bidi w:val="0"/>
               <w:spacing w:after="20"/>
             </w:pPr>
             <w:r>
@@ -200,6 +207,7 @@
           </w:p>
           <w:p>
             <w:pPr>
+              <w:bidi w:val="0"/>
               <w:spacing w:after="0"/>
               <w:ind w:left="330"/>
             </w:pPr>
@@ -234,6 +242,7 @@
           </w:tcPr>
           <w:p>
             <w:pPr>
+              <w:bidi w:val="0"/>
               <w:spacing w:after="20"/>
             </w:pPr>
             <w:r>
@@ -288,6 +297,7 @@
           </w:p>
           <w:p>
             <w:pPr>
+              <w:bidi w:val="0"/>
               <w:spacing w:after="0"/>
               <w:ind w:left="330"/>
             </w:pPr>
@@ -322,6 +332,7 @@
           </w:tcPr>
           <w:p>
             <w:pPr>
+              <w:bidi w:val="0"/>
               <w:spacing w:after="20"/>
             </w:pPr>
             <w:r>
@@ -376,6 +387,7 @@
           </w:p>
           <w:p>
             <w:pPr>
+              <w:bidi w:val="0"/>
               <w:spacing w:after="0"/>
               <w:ind w:left="330"/>
             </w:pPr>
@@ -398,6 +410,7 @@
         <w:tabs>
           <w:tab w:val="left" w:pos="480"/>
         </w:tabs>
+        <w:bidi w:val="0"/>
         <w:spacing w:after="30" w:before="400"/>
       </w:pPr>
       <w:r>
@@ -425,6 +438,7 @@
         <w:pBdr>
           <w:bottom w:val="single" w:color="E3E7F0" w:sz="6" w:space="10"/>
         </w:pBdr>
+        <w:bidi w:val="0"/>
         <w:spacing w:after="170"/>
         <w:ind w:left="480"/>
       </w:pPr>
@@ -440,6 +454,7 @@
     </w:p>
     <w:tbl>
       <w:tblPr>
+        <w:bidiVisual w:val="0"/>
         <w:tblW w:type="dxa" w:w="9986"/>
         <w:tblBorders>
           <w:top w:val="none" w:color="FFFFFF" w:sz="0"/>
@@ -479,6 +494,7 @@
           <w:p>
             <w:pPr>
               <w:keepNext/>
+              <w:bidi w:val="0"/>
               <w:spacing w:after="70"/>
             </w:pPr>
             <w:r>
@@ -521,6 +537,7 @@
           <w:p>
             <w:pPr>
               <w:keepNext/>
+              <w:bidi w:val="0"/>
               <w:spacing w:after="70"/>
             </w:pPr>
             <w:r>
@@ -554,6 +571,7 @@
           <w:p>
             <w:pPr>
               <w:keepNext/>
+              <w:bidi w:val="0"/>
               <w:spacing w:after="70"/>
             </w:pPr>
             <w:r>
@@ -603,6 +621,7 @@
           <w:p>
             <w:pPr>
               <w:keepNext/>
+              <w:bidi w:val="0"/>
               <w:spacing w:after="0"/>
             </w:pPr>
             <w:r>
@@ -636,6 +655,7 @@
           <w:p>
             <w:pPr>
               <w:keepNext/>
+              <w:bidi w:val="0"/>
               <w:spacing w:after="0"/>
             </w:pPr>
             <w:r>
@@ -670,6 +690,7 @@
           <w:p>
             <w:pPr>
               <w:keepNext/>
+              <w:bidi w:val="0"/>
               <w:spacing w:after="0"/>
             </w:pPr>
             <w:r>
@@ -708,6 +729,7 @@
           <w:p>
             <w:pPr>
               <w:keepNext w:val="false"/>
+              <w:bidi w:val="0"/>
               <w:spacing w:after="0" w:before="50"/>
             </w:pPr>
             <w:r>
@@ -741,6 +763,7 @@
           <w:p>
             <w:pPr>
               <w:keepNext w:val="false"/>
+              <w:bidi w:val="0"/>
               <w:spacing w:after="0" w:before="50"/>
             </w:pPr>
             <w:r>
@@ -774,6 +797,7 @@
           <w:p>
             <w:pPr>
               <w:keepNext w:val="false"/>
+              <w:bidi w:val="0"/>
               <w:spacing w:after="0" w:before="50"/>
             </w:pPr>
             <w:r>
@@ -792,6 +816,7 @@
     <w:p>
       <w:pPr>
         <w:keepNext w:val="false"/>
+        <w:bidi w:val="0"/>
         <w:spacing w:after="70" w:before="0" w:line="40" w:lineRule="exact"/>
       </w:pPr>
       <w:r>
@@ -810,6 +835,7 @@
         <w:tabs>
           <w:tab w:val="left" w:pos="480"/>
         </w:tabs>
+        <w:bidi w:val="0"/>
         <w:spacing w:after="30" w:before="400"/>
       </w:pPr>
       <w:r>
@@ -837,6 +863,7 @@
         <w:pBdr>
           <w:bottom w:val="single" w:color="E3E7F0" w:sz="6" w:space="10"/>
         </w:pBdr>
+        <w:bidi w:val="0"/>
         <w:spacing w:after="170"/>
         <w:ind w:left="480"/>
       </w:pPr>
@@ -852,6 +879,7 @@
     </w:p>
     <w:tbl>
       <w:tblPr>
+        <w:bidiVisual w:val="0"/>
         <w:tblW w:type="dxa" w:w="9986"/>
         <w:tblBorders>
           <w:top w:val="none" w:color="FFFFFF" w:sz="0"/>
@@ -889,6 +917,7 @@
           <w:p>
             <w:pPr>
               <w:keepNext/>
+              <w:bidi w:val="0"/>
               <w:spacing w:after="70"/>
             </w:pPr>
             <w:r>
@@ -938,6 +967,7 @@
           <w:p>
             <w:pPr>
               <w:keepNext/>
+              <w:bidi w:val="0"/>
               <w:spacing w:after="0"/>
             </w:pPr>
             <w:r>
@@ -976,6 +1006,7 @@
           <w:p>
             <w:pPr>
               <w:keepNext/>
+              <w:bidi w:val="0"/>
               <w:spacing w:after="0" w:before="50"/>
             </w:pPr>
             <w:r>
@@ -994,6 +1025,7 @@
     <w:p>
       <w:pPr>
         <w:keepNext/>
+        <w:bidi w:val="0"/>
         <w:spacing w:after="70" w:before="0" w:line="40" w:lineRule="exact"/>
       </w:pPr>
       <w:r>
@@ -1008,6 +1040,7 @@
     </w:p>
     <w:tbl>
       <w:tblPr>
+        <w:bidiVisual w:val="0"/>
         <w:tblW w:type="dxa" w:w="9986"/>
         <w:tblBorders>
           <w:top w:val="none" w:color="FFFFFF" w:sz="0"/>
@@ -1049,6 +1082,7 @@
           <w:p>
             <w:pPr>
               <w:keepNext/>
+              <w:bidi w:val="0"/>
               <w:spacing w:after="70"/>
             </w:pPr>
             <w:r>
@@ -1091,6 +1125,7 @@
           <w:p>
             <w:pPr>
               <w:keepNext/>
+              <w:bidi w:val="0"/>
               <w:spacing w:after="70"/>
             </w:pPr>
             <w:r>
@@ -1124,6 +1159,7 @@
           <w:p>
             <w:pPr>
               <w:keepNext/>
+              <w:bidi w:val="0"/>
               <w:spacing w:after="70"/>
             </w:pPr>
             <w:r>
@@ -1173,6 +1209,7 @@
           <w:p>
             <w:pPr>
               <w:keepNext/>
+              <w:bidi w:val="0"/>
               <w:spacing w:after="0"/>
             </w:pPr>
             <w:r>
@@ -1206,6 +1243,7 @@
           <w:p>
             <w:pPr>
               <w:keepNext/>
+              <w:bidi w:val="0"/>
               <w:spacing w:after="0"/>
             </w:pPr>
             <w:r>
@@ -1240,6 +1278,7 @@
           <w:p>
             <w:pPr>
               <w:keepNext/>
+              <w:bidi w:val="0"/>
               <w:spacing w:after="0"/>
             </w:pPr>
             <w:r>
@@ -1273,6 +1312,7 @@
           <w:p>
             <w:pPr>
               <w:keepNext/>
+              <w:bidi w:val="0"/>
               <w:spacing w:after="0"/>
             </w:pPr>
             <w:r>
@@ -1307,6 +1347,7 @@
           <w:p>
             <w:pPr>
               <w:keepNext/>
+              <w:bidi w:val="0"/>
               <w:spacing w:after="0"/>
             </w:pPr>
             <w:r>
@@ -1345,6 +1386,7 @@
           <w:p>
             <w:pPr>
               <w:keepNext w:val="false"/>
+              <w:bidi w:val="0"/>
               <w:spacing w:after="0" w:before="50"/>
             </w:pPr>
             <w:r>
@@ -1378,6 +1420,7 @@
           <w:p>
             <w:pPr>
               <w:keepNext w:val="false"/>
+              <w:bidi w:val="0"/>
               <w:spacing w:after="0" w:before="50"/>
             </w:pPr>
             <w:r>
@@ -1411,6 +1454,7 @@
           <w:p>
             <w:pPr>
               <w:keepNext w:val="false"/>
+              <w:bidi w:val="0"/>
               <w:spacing w:after="0" w:before="50"/>
             </w:pPr>
             <w:r>
@@ -1429,6 +1473,7 @@
     <w:p>
       <w:pPr>
         <w:keepNext w:val="false"/>
+        <w:bidi w:val="0"/>
         <w:spacing w:after="70" w:before="0" w:line="40" w:lineRule="exact"/>
       </w:pPr>
       <w:r>
@@ -1447,6 +1492,7 @@
         <w:tabs>
           <w:tab w:val="left" w:pos="480"/>
         </w:tabs>
+        <w:bidi w:val="0"/>
         <w:spacing w:after="30" w:before="400"/>
       </w:pPr>
       <w:r>
@@ -1474,6 +1520,7 @@
         <w:pBdr>
           <w:bottom w:val="single" w:color="E3E7F0" w:sz="6" w:space="10"/>
         </w:pBdr>
+        <w:bidi w:val="0"/>
         <w:spacing w:after="170"/>
         <w:ind w:left="480"/>
       </w:pPr>
@@ -1489,6 +1536,7 @@
     </w:p>
     <w:tbl>
       <w:tblPr>
+        <w:bidiVisual w:val="0"/>
         <w:tblW w:type="dxa" w:w="9986"/>
         <w:tblBorders>
           <w:top w:val="none" w:color="FFFFFF" w:sz="0"/>
@@ -1526,6 +1574,7 @@
           <w:p>
             <w:pPr>
               <w:keepNext/>
+              <w:bidi w:val="0"/>
               <w:spacing w:after="70"/>
             </w:pPr>
             <w:r>
@@ -1575,6 +1624,7 @@
           <w:p>
             <w:pPr>
               <w:keepNext/>
+              <w:bidi w:val="0"/>
               <w:spacing w:after="0"/>
             </w:pPr>
             <w:r>
@@ -1613,6 +1663,7 @@
           <w:p>
             <w:pPr>
               <w:keepNext/>
+              <w:bidi w:val="0"/>
               <w:spacing w:after="0" w:before="50"/>
             </w:pPr>
             <w:r>
@@ -1631,6 +1682,7 @@
     <w:p>
       <w:pPr>
         <w:keepNext/>
+        <w:bidi w:val="0"/>
         <w:spacing w:after="70" w:before="0" w:line="40" w:lineRule="exact"/>
       </w:pPr>
       <w:r>
@@ -1645,6 +1697,7 @@
     </w:p>
     <w:tbl>
       <w:tblPr>
+        <w:bidiVisual w:val="0"/>
         <w:tblW w:type="dxa" w:w="9986"/>
         <w:tblBorders>
           <w:top w:val="none" w:color="FFFFFF" w:sz="0"/>
@@ -1686,6 +1739,7 @@
           <w:p>
             <w:pPr>
               <w:keepNext/>
+              <w:bidi w:val="0"/>
               <w:spacing w:after="70"/>
             </w:pPr>
             <w:r>
@@ -1728,6 +1782,7 @@
           <w:p>
             <w:pPr>
               <w:keepNext/>
+              <w:bidi w:val="0"/>
               <w:spacing w:after="70"/>
             </w:pPr>
             <w:r>
@@ -1761,6 +1816,7 @@
           <w:p>
             <w:pPr>
               <w:keepNext/>
+              <w:bidi w:val="0"/>
               <w:spacing w:after="70"/>
             </w:pPr>
             <w:r>
@@ -1810,6 +1866,7 @@
           <w:p>
             <w:pPr>
               <w:keepNext/>
+              <w:bidi w:val="0"/>
               <w:spacing w:after="0"/>
             </w:pPr>
             <w:r>
@@ -1843,6 +1900,7 @@
           <w:p>
             <w:pPr>
               <w:keepNext/>
+              <w:bidi w:val="0"/>
               <w:spacing w:after="0"/>
             </w:pPr>
             <w:r>
@@ -1877,6 +1935,7 @@
           <w:p>
             <w:pPr>
               <w:keepNext/>
+              <w:bidi w:val="0"/>
               <w:spacing w:after="0"/>
             </w:pPr>
             <w:r>
@@ -1910,6 +1969,7 @@
           <w:p>
             <w:pPr>
               <w:keepNext/>
+              <w:bidi w:val="0"/>
               <w:spacing w:after="0"/>
             </w:pPr>
             <w:r>
@@ -1944,6 +2004,7 @@
           <w:p>
             <w:pPr>
               <w:keepNext/>
+              <w:bidi w:val="0"/>
               <w:spacing w:after="0"/>
             </w:pPr>
             <w:r>
@@ -1982,6 +2043,7 @@
           <w:p>
             <w:pPr>
               <w:keepNext w:val="false"/>
+              <w:bidi w:val="0"/>
               <w:spacing w:after="0" w:before="50"/>
             </w:pPr>
             <w:r>
@@ -2015,6 +2077,7 @@
           <w:p>
             <w:pPr>
               <w:keepNext w:val="false"/>
+              <w:bidi w:val="0"/>
               <w:spacing w:after="0" w:before="50"/>
             </w:pPr>
             <w:r>
@@ -2048,6 +2111,7 @@
           <w:p>
             <w:pPr>
               <w:keepNext w:val="false"/>
+              <w:bidi w:val="0"/>
               <w:spacing w:after="0" w:before="50"/>
             </w:pPr>
             <w:r>
@@ -2066,6 +2130,7 @@
     <w:p>
       <w:pPr>
         <w:keepNext w:val="false"/>
+        <w:bidi w:val="0"/>
         <w:spacing w:after="70" w:before="0" w:line="40" w:lineRule="exact"/>
       </w:pPr>
       <w:r>
@@ -2085,6 +2150,7 @@
         <w:tabs>
           <w:tab w:val="left" w:pos="480"/>
         </w:tabs>
+        <w:bidi w:val="0"/>
         <w:spacing w:after="30" w:before="0"/>
       </w:pPr>
       <w:r>
@@ -2112,6 +2178,7 @@
         <w:pBdr>
           <w:bottom w:val="single" w:color="E3E7F0" w:sz="6" w:space="10"/>
         </w:pBdr>
+        <w:bidi w:val="0"/>
         <w:spacing w:after="170"/>
         <w:ind w:left="480"/>
       </w:pPr>
@@ -2127,6 +2194,7 @@
     </w:p>
     <w:tbl>
       <w:tblPr>
+        <w:bidiVisual w:val="0"/>
         <w:tblW w:type="dxa" w:w="9986"/>
         <w:tblBorders>
           <w:top w:val="none" w:color="FFFFFF" w:sz="0"/>
@@ -2164,6 +2232,7 @@
           <w:p>
             <w:pPr>
               <w:keepNext/>
+              <w:bidi w:val="0"/>
               <w:spacing w:after="70"/>
             </w:pPr>
             <w:r>
@@ -2213,6 +2282,7 @@
           <w:p>
             <w:pPr>
               <w:keepNext/>
+              <w:bidi w:val="0"/>
               <w:spacing w:after="0"/>
             </w:pPr>
             <w:r>
@@ -2251,6 +2321,7 @@
           <w:p>
             <w:pPr>
               <w:keepNext/>
+              <w:bidi w:val="0"/>
               <w:spacing w:after="0" w:before="50"/>
             </w:pPr>
             <w:r>
@@ -2269,6 +2340,7 @@
     <w:p>
       <w:pPr>
         <w:keepNext/>
+        <w:bidi w:val="0"/>
         <w:spacing w:after="70" w:before="0" w:line="40" w:lineRule="exact"/>
       </w:pPr>
       <w:r>
@@ -2283,6 +2355,7 @@
     </w:p>
     <w:tbl>
       <w:tblPr>
+        <w:bidiVisual w:val="0"/>
         <w:tblW w:type="dxa" w:w="9986"/>
         <w:tblBorders>
           <w:top w:val="none" w:color="FFFFFF" w:sz="0"/>
@@ -2324,6 +2397,7 @@
           <w:p>
             <w:pPr>
               <w:keepNext/>
+              <w:bidi w:val="0"/>
               <w:spacing w:after="70"/>
             </w:pPr>
             <w:r>
@@ -2366,6 +2440,7 @@
           <w:p>
             <w:pPr>
               <w:keepNext/>
+              <w:bidi w:val="0"/>
               <w:spacing w:after="70"/>
             </w:pPr>
             <w:r>
@@ -2399,6 +2474,7 @@
           <w:p>
             <w:pPr>
               <w:keepNext/>
+              <w:bidi w:val="0"/>
               <w:spacing w:after="70"/>
             </w:pPr>
             <w:r>
@@ -2448,6 +2524,7 @@
           <w:p>
             <w:pPr>
               <w:keepNext/>
+              <w:bidi w:val="0"/>
               <w:spacing w:after="0"/>
             </w:pPr>
             <w:r>
@@ -2481,6 +2558,7 @@
           <w:p>
             <w:pPr>
               <w:keepNext/>
+              <w:bidi w:val="0"/>
               <w:spacing w:after="0"/>
             </w:pPr>
             <w:r>
@@ -2515,6 +2593,7 @@
           <w:p>
             <w:pPr>
               <w:keepNext/>
+              <w:bidi w:val="0"/>
               <w:spacing w:after="0"/>
             </w:pPr>
             <w:r>
@@ -2548,6 +2627,7 @@
           <w:p>
             <w:pPr>
               <w:keepNext/>
+              <w:bidi w:val="0"/>
               <w:spacing w:after="0"/>
             </w:pPr>
             <w:r>
@@ -2582,6 +2662,7 @@
           <w:p>
             <w:pPr>
               <w:keepNext/>
+              <w:bidi w:val="0"/>
               <w:spacing w:after="0"/>
             </w:pPr>
             <w:r>
@@ -2620,6 +2701,7 @@
           <w:p>
             <w:pPr>
               <w:keepNext w:val="false"/>
+              <w:bidi w:val="0"/>
               <w:spacing w:after="0" w:before="50"/>
             </w:pPr>
             <w:r>
@@ -2653,6 +2735,7 @@
           <w:p>
             <w:pPr>
               <w:keepNext w:val="false"/>
+              <w:bidi w:val="0"/>
               <w:spacing w:after="0" w:before="50"/>
             </w:pPr>
             <w:r>
@@ -2686,6 +2769,7 @@
           <w:p>
             <w:pPr>
               <w:keepNext w:val="false"/>
+              <w:bidi w:val="0"/>
               <w:spacing w:after="0" w:before="50"/>
             </w:pPr>
             <w:r>
@@ -2704,6 +2788,7 @@
     <w:p>
       <w:pPr>
         <w:keepNext w:val="false"/>
+        <w:bidi w:val="0"/>
         <w:spacing w:after="70" w:before="0" w:line="40" w:lineRule="exact"/>
       </w:pPr>
       <w:r>
@@ -2722,6 +2807,7 @@
         <w:tabs>
           <w:tab w:val="left" w:pos="480"/>
         </w:tabs>
+        <w:bidi w:val="0"/>
         <w:spacing w:after="30" w:before="400"/>
       </w:pPr>
       <w:r>
@@ -2749,6 +2835,7 @@
         <w:pBdr>
           <w:bottom w:val="single" w:color="E3E7F0" w:sz="6" w:space="10"/>
         </w:pBdr>
+        <w:bidi w:val="0"/>
         <w:spacing w:after="170"/>
         <w:ind w:left="480"/>
       </w:pPr>
@@ -2764,6 +2851,7 @@
     </w:p>
     <w:tbl>
       <w:tblPr>
+        <w:bidiVisual w:val="0"/>
         <w:tblW w:type="dxa" w:w="9986"/>
         <w:tblBorders>
           <w:top w:val="none" w:color="FFFFFF" w:sz="0"/>
@@ -2801,6 +2889,7 @@
           <w:p>
             <w:pPr>
               <w:keepNext/>
+              <w:bidi w:val="0"/>
               <w:spacing w:after="70"/>
             </w:pPr>
             <w:r>
@@ -2850,6 +2939,7 @@
           <w:p>
             <w:pPr>
               <w:keepNext/>
+              <w:bidi w:val="0"/>
               <w:spacing w:after="0"/>
             </w:pPr>
             <w:r>
@@ -2888,6 +2978,7 @@
           <w:p>
             <w:pPr>
               <w:keepNext/>
+              <w:bidi w:val="0"/>
               <w:spacing w:after="0" w:before="50"/>
             </w:pPr>
             <w:r>
@@ -2906,6 +2997,7 @@
     <w:p>
       <w:pPr>
         <w:keepNext/>
+        <w:bidi w:val="0"/>
         <w:spacing w:after="70" w:before="0" w:line="40" w:lineRule="exact"/>
       </w:pPr>
       <w:r>
@@ -2920,6 +3012,7 @@
     </w:p>
     <w:tbl>
       <w:tblPr>
+        <w:bidiVisual w:val="0"/>
         <w:tblW w:type="dxa" w:w="9986"/>
         <w:tblBorders>
           <w:top w:val="none" w:color="FFFFFF" w:sz="0"/>
@@ -2961,6 +3054,7 @@
           <w:p>
             <w:pPr>
               <w:keepNext/>
+              <w:bidi w:val="0"/>
               <w:spacing w:after="70"/>
             </w:pPr>
             <w:r>
@@ -3003,6 +3097,7 @@
           <w:p>
             <w:pPr>
               <w:keepNext/>
+              <w:bidi w:val="0"/>
               <w:spacing w:after="70"/>
             </w:pPr>
             <w:r>
@@ -3036,6 +3131,7 @@
           <w:p>
             <w:pPr>
               <w:keepNext/>
+              <w:bidi w:val="0"/>
               <w:spacing w:after="70"/>
             </w:pPr>
             <w:r>
@@ -3085,6 +3181,7 @@
           <w:p>
             <w:pPr>
               <w:keepNext/>
+              <w:bidi w:val="0"/>
               <w:spacing w:after="0"/>
             </w:pPr>
             <w:r>
@@ -3118,6 +3215,7 @@
           <w:p>
             <w:pPr>
               <w:keepNext/>
+              <w:bidi w:val="0"/>
               <w:spacing w:after="0"/>
             </w:pPr>
             <w:r>
@@ -3152,6 +3250,7 @@
           <w:p>
             <w:pPr>
               <w:keepNext/>
+              <w:bidi w:val="0"/>
               <w:spacing w:after="0"/>
             </w:pPr>
             <w:r>
@@ -3185,6 +3284,7 @@
           <w:p>
             <w:pPr>
               <w:keepNext/>
+              <w:bidi w:val="0"/>
               <w:spacing w:after="0"/>
             </w:pPr>
             <w:r>
@@ -3219,6 +3319,7 @@
           <w:p>
             <w:pPr>
               <w:keepNext/>
+              <w:bidi w:val="0"/>
               <w:spacing w:after="0"/>
             </w:pPr>
             <w:r>
@@ -3257,6 +3358,7 @@
           <w:p>
             <w:pPr>
               <w:keepNext w:val="false"/>
+              <w:bidi w:val="0"/>
               <w:spacing w:after="0" w:before="50"/>
             </w:pPr>
             <w:r>
@@ -3290,6 +3392,7 @@
           <w:p>
             <w:pPr>
               <w:keepNext w:val="false"/>
+              <w:bidi w:val="0"/>
               <w:spacing w:after="0" w:before="50"/>
             </w:pPr>
             <w:r>
@@ -3323,6 +3426,7 @@
           <w:p>
             <w:pPr>
               <w:keepNext w:val="false"/>
+              <w:bidi w:val="0"/>
               <w:spacing w:after="0" w:before="50"/>
             </w:pPr>
             <w:r>
@@ -3341,6 +3445,7 @@
     <w:p>
       <w:pPr>
         <w:keepNext w:val="false"/>
+        <w:bidi w:val="0"/>
         <w:spacing w:after="70" w:before="0" w:line="40" w:lineRule="exact"/>
       </w:pPr>
       <w:r>
@@ -3419,6 +3524,7 @@
         <w:tab w:val="center" w:pos="4993"/>
         <w:tab w:val="right" w:pos="9986"/>
       </w:tabs>
+      <w:bidi w:val="0"/>
     </w:pPr>
     <w:r>
       <w:rPr>
@@ -3499,6 +3605,7 @@
       <w:tabs>
         <w:tab w:val="right" w:pos="9986"/>
       </w:tabs>
+      <w:bidi w:val="0"/>
       <w:spacing w:after="40"/>
     </w:pPr>
     <w:r>
@@ -3559,6 +3666,7 @@
       <w:tabs>
         <w:tab w:val="right" w:pos="9986"/>
       </w:tabs>
+      <w:bidi w:val="0"/>
       <w:spacing w:after="0"/>
     </w:pPr>
     <w:r>
@@ -3687,11 +3795,15 @@
         <w:color w:val="11162B"/>
         <w:sz w:val="20"/>
         <w:szCs w:val="20"/>
+        <w:rtl w:val="0"/>
+        <w:lang w:val="en-US" w:eastAsia="en-US" w:bidi="ar-SA"/>
       </w:rPr>
     </w:rPrDefault>
     <w:pPrDefault>
       <w:pPr>
+        <w:bidi w:val="0"/>
         <w:spacing w:after="0"/>
+        <w:jc w:val="left"/>
       </w:pPr>
     </w:pPrDefault>
   </w:docDefaults>
@@ -3810,6 +3922,7 @@
     <w:semiHidden/>
     <w:unhideWhenUsed/>
     <w:pPr>
+      <w:bidi w:val="0"/>
       <w:spacing w:after="0" w:line="240" w:lineRule="auto"/>
     </w:pPr>
     <w:rPr>
@@ -3847,6 +3960,7 @@
     <w:semiHidden/>
     <w:unhideWhenUsed/>
     <w:pPr>
+      <w:bidi w:val="0"/>
       <w:spacing w:after="0" w:line="240" w:lineRule="auto"/>
     </w:pPr>
     <w:rPr>

</xml_diff>